<commit_message>
fix(analyzer): complete multi-concept taxonomy across 100% of JEE and KCET chapters
</commit_message>
<xml_diff>
--- a/data/exports/3d-geometry_revision_notes.docx
+++ b/data/exports/3d-geometry_revision_notes.docx
@@ -189,7 +189,7 @@
                 <w:color w:val="2D3748"/>
                 <w:sz w:val="19"/>
               </w:rPr>
-              <w:t>3D Geometry - Core Application</w:t>
+              <w:t>Planes &amp; Line-Plane Intersections in 3D</w:t>
             </w:r>
           </w:p>
         </w:tc>
@@ -209,7 +209,7 @@
               <w:rPr>
                 <w:sz w:val="19"/>
               </w:rPr>
-              <w:t>385 PYQs</w:t>
+              <w:t>209 PYQs</w:t>
             </w:r>
           </w:p>
         </w:tc>
@@ -230,7 +230,94 @@
                 <w:color w:val="718096"/>
                 <w:sz w:val="19"/>
               </w:rPr>
-              <w:t>General Concept</w:t>
+              <w:t>3D Planes</w:t>
+            </w:r>
+          </w:p>
+        </w:tc>
+      </w:tr>
+      <w:tr>
+        <w:tc>
+          <w:tcPr>
+            <w:tcW w:type="dxa" w:w="2160"/>
+            <w:shd w:fill="FFFFFF"/>
+            <w:tcMar>
+              <w:top w:w="80" w:type="dxa"/>
+              <w:bottom w:w="80" w:type="dxa"/>
+              <w:left w:w="150" w:type="dxa"/>
+              <w:right w:w="150" w:type="dxa"/>
+            </w:tcMar>
+          </w:tcPr>
+          <w:p>
+            <w:r>
+              <w:rPr>
+                <w:b/>
+                <w:color w:val="C53030"/>
+                <w:sz w:val="19"/>
+              </w:rPr>
+              <w:t>Very High</w:t>
+            </w:r>
+          </w:p>
+        </w:tc>
+        <w:tc>
+          <w:tcPr>
+            <w:tcW w:type="dxa" w:w="4320"/>
+            <w:shd w:fill="FFFFFF"/>
+            <w:tcMar>
+              <w:top w:w="80" w:type="dxa"/>
+              <w:bottom w:w="80" w:type="dxa"/>
+              <w:left w:w="150" w:type="dxa"/>
+              <w:right w:w="150" w:type="dxa"/>
+            </w:tcMar>
+          </w:tcPr>
+          <w:p>
+            <w:r>
+              <w:rPr>
+                <w:b/>
+                <w:color w:val="2D3748"/>
+                <w:sz w:val="19"/>
+              </w:rPr>
+              <w:t>Direction Cosines &amp; Equations of Lines in 3D</w:t>
+            </w:r>
+          </w:p>
+        </w:tc>
+        <w:tc>
+          <w:tcPr>
+            <w:tcW w:type="dxa" w:w="1728"/>
+            <w:shd w:fill="FFFFFF"/>
+            <w:tcMar>
+              <w:top w:w="80" w:type="dxa"/>
+              <w:bottom w:w="80" w:type="dxa"/>
+              <w:left w:w="150" w:type="dxa"/>
+              <w:right w:w="150" w:type="dxa"/>
+            </w:tcMar>
+          </w:tcPr>
+          <w:p>
+            <w:r>
+              <w:rPr>
+                <w:sz w:val="19"/>
+              </w:rPr>
+              <w:t>185 PYQs</w:t>
+            </w:r>
+          </w:p>
+        </w:tc>
+        <w:tc>
+          <w:tcPr>
+            <w:tcW w:type="dxa" w:w="1872"/>
+            <w:shd w:fill="FFFFFF"/>
+            <w:tcMar>
+              <w:top w:w="80" w:type="dxa"/>
+              <w:bottom w:w="80" w:type="dxa"/>
+              <w:left w:w="150" w:type="dxa"/>
+              <w:right w:w="150" w:type="dxa"/>
+            </w:tcMar>
+          </w:tcPr>
+          <w:p>
+            <w:r>
+              <w:rPr>
+                <w:color w:val="718096"/>
+                <w:sz w:val="19"/>
+              </w:rPr>
+              <w:t>3D Lines</w:t>
             </w:r>
           </w:p>
         </w:tc>
@@ -311,6 +398,98 @@
           </w:p>
         </w:tc>
       </w:tr>
+      <w:tr>
+        <w:tc>
+          <w:tcPr>
+            <w:tcW w:type="dxa" w:w="3600"/>
+            <w:shd w:fill="F7FAFC"/>
+            <w:tcMar>
+              <w:top w:w="100" w:type="dxa"/>
+              <w:bottom w:w="100" w:type="dxa"/>
+              <w:left w:w="150" w:type="dxa"/>
+              <w:right w:w="150" w:type="dxa"/>
+            </w:tcMar>
+          </w:tcPr>
+          <w:p>
+            <w:r>
+              <w:rPr>
+                <w:b/>
+                <w:color w:val="1A365D"/>
+                <w:sz w:val="19"/>
+              </w:rPr>
+              <w:t>Planes &amp; Line-Plane Intersections in 3D</w:t>
+            </w:r>
+          </w:p>
+        </w:tc>
+        <w:tc>
+          <w:tcPr>
+            <w:tcW w:type="dxa" w:w="6480"/>
+            <w:shd w:fill="F7FAFC"/>
+            <w:tcMar>
+              <w:top w:w="100" w:type="dxa"/>
+              <w:bottom w:w="100" w:type="dxa"/>
+              <w:left w:w="150" w:type="dxa"/>
+              <w:right w:w="150" w:type="dxa"/>
+            </w:tcMar>
+          </w:tcPr>
+          <w:p>
+            <w:r>
+              <w:rPr>
+                <w:rFonts w:ascii="Cambria Math" w:hAnsi="Cambria Math"/>
+                <w:color w:val="2D3748"/>
+                <w:sz w:val="19"/>
+              </w:rPr>
+              <w:t>a(x - x_1) + b(y - y_1) + c(z - z_1) = 0, \quad d = \frac{|ax_1 + by_1 + cz_1 + d|}{\sqrt{a^2 + b^2 + c^2}}, \quad \sin\theta = \frac{|\vec{b} \cdot \vec{n}|}{|\vec{b}||\vec{n}|}</w:t>
+            </w:r>
+          </w:p>
+        </w:tc>
+      </w:tr>
+      <w:tr>
+        <w:tc>
+          <w:tcPr>
+            <w:tcW w:type="dxa" w:w="3600"/>
+            <w:shd w:fill="FFFFFF"/>
+            <w:tcMar>
+              <w:top w:w="100" w:type="dxa"/>
+              <w:bottom w:w="100" w:type="dxa"/>
+              <w:left w:w="150" w:type="dxa"/>
+              <w:right w:w="150" w:type="dxa"/>
+            </w:tcMar>
+          </w:tcPr>
+          <w:p>
+            <w:r>
+              <w:rPr>
+                <w:b/>
+                <w:color w:val="1A365D"/>
+                <w:sz w:val="19"/>
+              </w:rPr>
+              <w:t>Direction Cosines &amp; Equations of Lines in 3D</w:t>
+            </w:r>
+          </w:p>
+        </w:tc>
+        <w:tc>
+          <w:tcPr>
+            <w:tcW w:type="dxa" w:w="6480"/>
+            <w:shd w:fill="FFFFFF"/>
+            <w:tcMar>
+              <w:top w:w="100" w:type="dxa"/>
+              <w:bottom w:w="100" w:type="dxa"/>
+              <w:left w:w="150" w:type="dxa"/>
+              <w:right w:w="150" w:type="dxa"/>
+            </w:tcMar>
+          </w:tcPr>
+          <w:p>
+            <w:r>
+              <w:rPr>
+                <w:rFonts w:ascii="Cambria Math" w:hAnsi="Cambria Math"/>
+                <w:color w:val="2D3748"/>
+                <w:sz w:val="19"/>
+              </w:rPr>
+              <w:t>l^2 + m^2 + n^2 = 1, \quad \frac{x - x_1}{a} = \frac{y - y_1}{b} = \frac{z - z_1}{c}, \quad d_{\text{skew}} = \frac{|(\vec{a}_2 - \vec{a}_1) \cdot (\vec{b}_1 \times \vec{b}_2)|}{|\vec{b}_1 \times \vec{b}_2|}</w:t>
+            </w:r>
+          </w:p>
+        </w:tc>
+      </w:tr>
     </w:tbl>
     <w:p>
       <w:pPr>
@@ -338,7 +517,7 @@
           <w:color w:val="2B6CB0"/>
           <w:sz w:val="24"/>
         </w:rPr>
-        <w:t>3.1 3D Geometry - Core Application (Very High Yield — 385 PYQs)</w:t>
+        <w:t>3.1 Planes &amp; Line-Plane Intersections in 3D (Very High Yield — 209 PYQs)</w:t>
       </w:r>
     </w:p>
     <w:p>
@@ -353,7 +532,7 @@
         <w:rPr>
           <w:sz w:val="20"/>
         </w:rPr>
-        <w:t>Key problem pattern in 3D Geometry.</w:t>
+        <w:t>Normal vector to a plane, perpendicular distance from point to plane, and angle between a line and plane (uses sinθ).</w:t>
       </w:r>
     </w:p>
     <w:tbl>
@@ -391,7 +570,7 @@
                 <w:color w:val="2D3748"/>
                 <w:sz w:val="19"/>
               </w:rPr>
-              <w:t>Watch for algebraic and sign errors.</w:t>
+              <w:t>Angle between a LINE (vector vec(b)) and a PLANE (normal vec(n)) is computed with SINE (sinθ = \frac|vec(b) · vec(n)||vec(b)||vec(n)|), NOT cosine!</w:t>
             </w:r>
           </w:p>
         </w:tc>
@@ -432,7 +611,7 @@
                 <w:color w:val="2D3748"/>
                 <w:sz w:val="19"/>
               </w:rPr>
-              <w:t>Verify dimensions and boundary conditions.</w:t>
+              <w:t>A line is parallel to a plane if and only if it is perpendicular to the plane's normal: vec(b) · vec(n) = 0.</w:t>
             </w:r>
           </w:p>
         </w:tc>
@@ -530,6 +709,214 @@
           <w:sz w:val="18"/>
         </w:rPr>
         <w:t>[Ans: B]</w:t>
+      </w:r>
+    </w:p>
+    <w:p>
+      <w:pPr>
+        <w:spacing w:after="120"/>
+      </w:pPr>
+    </w:p>
+    <w:p>
+      <w:pPr>
+        <w:pStyle w:val="Heading2"/>
+      </w:pPr>
+      <w:r>
+        <w:rPr>
+          <w:color w:val="2B6CB0"/>
+          <w:sz w:val="24"/>
+        </w:rPr>
+        <w:t>3.2 Direction Cosines &amp; Equations of Lines in 3D (Very High Yield — 185 PYQs)</w:t>
+      </w:r>
+    </w:p>
+    <w:p>
+      <w:r>
+        <w:rPr>
+          <w:b/>
+          <w:sz w:val="20"/>
+        </w:rPr>
+        <w:t xml:space="preserve">Core Principle: </w:t>
+      </w:r>
+      <w:r>
+        <w:rPr>
+          <w:sz w:val="20"/>
+        </w:rPr>
+        <w:t>Direction cosines (l, m, n), line passing through two points, and shortest distance formula between skew lines.</w:t>
+      </w:r>
+    </w:p>
+    <w:tbl>
+      <w:tblPr>
+        <w:tblW w:type="auto" w:w="0"/>
+        <w:jc w:val="center"/>
+        <w:tblLook w:firstColumn="1" w:firstRow="1" w:lastColumn="0" w:lastRow="0" w:noHBand="0" w:noVBand="1" w:val="04A0"/>
+      </w:tblPr>
+      <w:tblGrid>
+        <w:gridCol w:w="10080"/>
+      </w:tblGrid>
+      <w:tr>
+        <w:tc>
+          <w:tcPr>
+            <w:tcW w:type="dxa" w:w="10080"/>
+            <w:shd w:fill="FFF5F5"/>
+            <w:tcMar>
+              <w:top w:w="100" w:type="dxa"/>
+              <w:bottom w:w="100" w:type="dxa"/>
+              <w:left w:w="150" w:type="dxa"/>
+              <w:right w:w="150" w:type="dxa"/>
+            </w:tcMar>
+          </w:tcPr>
+          <w:p>
+            <w:r>
+              <w:rPr>
+                <w:b/>
+                <w:color w:val="C53030"/>
+                <w:sz w:val="19"/>
+              </w:rPr>
+              <w:t xml:space="preserve">⚠️ Common Trap / JEE Pitfall: </w:t>
+            </w:r>
+            <w:r>
+              <w:rPr>
+                <w:color w:val="2D3748"/>
+                <w:sz w:val="19"/>
+              </w:rPr>
+              <w:t>Direction ratios (a, b, c) can be any proportional numbers, but direction cosines (l, m, n) MUST satisfy l^2 + m^2 + n^2 = 1.</w:t>
+            </w:r>
+          </w:p>
+        </w:tc>
+      </w:tr>
+    </w:tbl>
+    <w:tbl>
+      <w:tblPr>
+        <w:tblW w:type="auto" w:w="0"/>
+        <w:jc w:val="center"/>
+        <w:tblLook w:firstColumn="1" w:firstRow="1" w:lastColumn="0" w:lastRow="0" w:noHBand="0" w:noVBand="1" w:val="04A0"/>
+      </w:tblPr>
+      <w:tblGrid>
+        <w:gridCol w:w="10080"/>
+      </w:tblGrid>
+      <w:tr>
+        <w:tc>
+          <w:tcPr>
+            <w:tcW w:type="dxa" w:w="10080"/>
+            <w:shd w:fill="F0FFF4"/>
+            <w:tcMar>
+              <w:top w:w="100" w:type="dxa"/>
+              <w:bottom w:w="100" w:type="dxa"/>
+              <w:left w:w="150" w:type="dxa"/>
+              <w:right w:w="150" w:type="dxa"/>
+            </w:tcMar>
+          </w:tcPr>
+          <w:p>
+            <w:r>
+              <w:rPr>
+                <w:b/>
+                <w:color w:val="276749"/>
+                <w:sz w:val="19"/>
+              </w:rPr>
+              <w:t xml:space="preserve">💡 Speed Hack / Trick: </w:t>
+            </w:r>
+            <w:r>
+              <w:rPr>
+                <w:color w:val="2D3748"/>
+                <w:sz w:val="19"/>
+              </w:rPr>
+              <w:t>Two lines in 3D intersect (are coplanar) if and only if the shortest distance between them is ZERO: (vec(a)_2 - vec(a)_1) · (vec(b)_1 × vec(b)_2) = 0.</w:t>
+            </w:r>
+          </w:p>
+        </w:tc>
+      </w:tr>
+    </w:tbl>
+    <w:p>
+      <w:pPr>
+        <w:spacing w:before="120" w:after="40"/>
+      </w:pPr>
+      <w:r>
+        <w:rPr>
+          <w:b/>
+          <w:color w:val="1A365D"/>
+          <w:sz w:val="19"/>
+        </w:rPr>
+        <w:t>Source PYQs testing this concept:</w:t>
+      </w:r>
+    </w:p>
+    <w:p>
+      <w:pPr>
+        <w:pStyle w:val="ListBullet"/>
+        <w:spacing w:after="40"/>
+      </w:pPr>
+      <w:r>
+        <w:rPr>
+          <w:b/>
+          <w:sz w:val="18"/>
+        </w:rPr>
+        <w:t xml:space="preserve">[2026 Evening Shift] Q#1 (MCQ): </w:t>
+      </w:r>
+      <w:r>
+        <w:rPr>
+          <w:sz w:val="18"/>
+        </w:rPr>
+        <w:t xml:space="preserve">"Let the point A be the foot of perpendicular drawn from the point P (a,b,0) on the line (x-1 / 2)=(y-2 / 1)=(z-α / 3). ..."  </w:t>
+      </w:r>
+      <w:r>
+        <w:rPr>
+          <w:b/>
+          <w:color w:val="2B6CB0"/>
+          <w:sz w:val="18"/>
+        </w:rPr>
+        <w:t>[Ans: N/A]</w:t>
+      </w:r>
+    </w:p>
+    <w:p>
+      <w:pPr>
+        <w:pStyle w:val="ListBullet"/>
+        <w:spacing w:after="40"/>
+      </w:pPr>
+      <w:r>
+        <w:rPr>
+          <w:b/>
+          <w:sz w:val="18"/>
+        </w:rPr>
+        <w:t xml:space="preserve">[2026 Evening Shift] Q#2 (MCQ): </w:t>
+      </w:r>
+      <w:r>
+        <w:rPr>
+          <w:sz w:val="18"/>
+        </w:rPr>
+        <w:t xml:space="preserve">"The shortest distance between the lines (x-4 / 1)=(y-3 / 2)=(z-2 / -3) and (x+2 / 2)=(y-6 / 4)=(z-5 / -5) is:..."  </w:t>
+      </w:r>
+      <w:r>
+        <w:rPr>
+          <w:b/>
+          <w:color w:val="2B6CB0"/>
+          <w:sz w:val="18"/>
+        </w:rPr>
+        <w:t>[Ans: N/A]</w:t>
+      </w:r>
+    </w:p>
+    <w:p>
+      <w:pPr>
+        <w:pStyle w:val="ListBullet"/>
+        <w:spacing w:after="40"/>
+      </w:pPr>
+      <w:r>
+        <w:rPr>
+          <w:b/>
+          <w:sz w:val="18"/>
+        </w:rPr>
+        <w:t xml:space="preserve">[2026 Evening Shift] Q#2 (MCQ): </w:t>
+      </w:r>
+      <w:r>
+        <w:rPr>
+          <w:sz w:val="18"/>
+        </w:rPr>
+        <w:t xml:space="preserve">"If the distance of the point (a,2,5) from the image of the point (1,2,7) in the line (x / 1)=(y-1 / 1)=(z-2 / 2) is 4 , th..."  </w:t>
+      </w:r>
+      <w:r>
+        <w:rPr>
+          <w:b/>
+          <w:color w:val="2B6CB0"/>
+          <w:sz w:val="18"/>
+        </w:rPr>
+        <w:t>[Ans: C]</w:t>
       </w:r>
     </w:p>
     <w:p>
@@ -662,6 +1049,129 @@
               <w:t>Solution Analysis:</w:t>
               <w:br/>
               <w:t>Write the given line in parametric form. (x+3 / 8)=(y-4 / 2)=(z+1 / 2)=t So any point on the line is P(t)=(-3+8t,4+2t,-1+2t) Since both P and Q lie on this line and are at a distance 6 from R(1,2,3) , we find the points on the line whose distance from R is 6 . Distance condition: √((x-1)^2)+(y-2)^2+(z-3)^2=6 Substitute x=-3+8t,y=4+2t,z=-1+2t : (-3+8t-1)^2+(4+2t-2)^2+(-1+2t-3)^2=36 (8t-4)^2+(2t+2)^2+(2t-4)^2=36 Now expand: 64t^2-64t+16+4t^2+8t+4+4t^2-16t+16=36 72t^2-72t+36=36 72t^2-72t=0 72t(t-1)=0 So, t=0ort=1 Hence the two points are: For t=0 , P=(-3,4,-1) For t=1 , Q=(5,6,1) Now centroid of triangle PQR is (α,β,γ)=(\fracx_(P)+x_(Q)+x_(R)3,\fracy_(P)+y_(Q)+y_(R)3,\fracz_(P)+z_(Q)+z_(R)3) Substitute P=(-3,4,-1) , Q=(5,6,1) , R=(1,2,3) : α=(-3+5+1 / 3)=(3 / 3)=1 β=(4+6+2 / 3)=(12 / 3)=4 γ=(-1+1+3 / 3)=(3 / 3)=1 Therefore, α+β+γ=1+4+1=6 So the correct answer is: 6 Hence, Option C is correct.</w:t>
+            </w:r>
+          </w:p>
+        </w:tc>
+      </w:tr>
+    </w:tbl>
+    <w:p>
+      <w:pPr>
+        <w:spacing w:after="120"/>
+      </w:pPr>
+    </w:p>
+    <w:p>
+      <w:pPr>
+        <w:spacing w:before="160" w:after="40"/>
+      </w:pPr>
+      <w:r>
+        <w:rPr>
+          <w:b/>
+          <w:color w:val="1A365D"/>
+          <w:sz w:val="22"/>
+        </w:rPr>
+        <w:t>Benchmark Problem 2: JEE Main 2026 (Online) 5th April Evening Shift (Q#2)</w:t>
+      </w:r>
+    </w:p>
+    <w:p>
+      <w:pPr>
+        <w:spacing w:after="80"/>
+      </w:pPr>
+      <w:r>
+        <w:rPr>
+          <w:sz w:val="20"/>
+        </w:rPr>
+        <w:t>If the distance of the point (a,2,5) from the image of the point (1,2,7) in the line (x / 1)=(y-1 / 1)=(z-2 / 2) is 4 , then the sum of all possible values of a is equal to :</w:t>
+      </w:r>
+    </w:p>
+    <w:p>
+      <w:pPr>
+        <w:pStyle w:val="ListBullet"/>
+        <w:spacing w:after="20"/>
+      </w:pPr>
+      <w:r>
+        <w:rPr>
+          <w:sz w:val="19"/>
+        </w:rPr>
+        <w:t>(A) 11</w:t>
+      </w:r>
+    </w:p>
+    <w:p>
+      <w:pPr>
+        <w:pStyle w:val="ListBullet"/>
+        <w:spacing w:after="20"/>
+      </w:pPr>
+      <w:r>
+        <w:rPr>
+          <w:sz w:val="19"/>
+        </w:rPr>
+        <w:t>(B) 9</w:t>
+      </w:r>
+    </w:p>
+    <w:p>
+      <w:pPr>
+        <w:pStyle w:val="ListBullet"/>
+        <w:spacing w:after="20"/>
+      </w:pPr>
+      <w:r>
+        <w:rPr>
+          <w:b/>
+          <w:color w:val="276749"/>
+          <w:sz w:val="19"/>
+        </w:rPr>
+        <w:t>(C) 6</w:t>
+      </w:r>
+    </w:p>
+    <w:p>
+      <w:pPr>
+        <w:pStyle w:val="ListBullet"/>
+        <w:spacing w:after="20"/>
+      </w:pPr>
+      <w:r>
+        <w:rPr>
+          <w:sz w:val="19"/>
+        </w:rPr>
+        <w:t>(D) 4</w:t>
+      </w:r>
+    </w:p>
+    <w:tbl>
+      <w:tblPr>
+        <w:tblW w:type="auto" w:w="0"/>
+        <w:jc w:val="center"/>
+        <w:tblLook w:firstColumn="1" w:firstRow="1" w:lastColumn="0" w:lastRow="0" w:noHBand="0" w:noVBand="1" w:val="04A0"/>
+      </w:tblPr>
+      <w:tblGrid>
+        <w:gridCol w:w="10080"/>
+      </w:tblGrid>
+      <w:tr>
+        <w:tc>
+          <w:tcPr>
+            <w:tcW w:type="dxa" w:w="10080"/>
+            <w:shd w:fill="F7FAFC"/>
+            <w:tcMar>
+              <w:top w:w="100" w:type="dxa"/>
+              <w:bottom w:w="100" w:type="dxa"/>
+              <w:left w:w="150" w:type="dxa"/>
+              <w:right w:w="150" w:type="dxa"/>
+            </w:tcMar>
+          </w:tcPr>
+          <w:p>
+            <w:r>
+              <w:rPr>
+                <w:b/>
+                <w:color w:val="1A365D"/>
+                <w:sz w:val="19"/>
+              </w:rPr>
+              <w:t>Correct Answer: C</w:t>
+              <w:br/>
+            </w:r>
+            <w:r>
+              <w:rPr>
+                <w:color w:val="2D3748"/>
+                <w:sz w:val="18"/>
+              </w:rPr>
+              <w:t>Solution Analysis:</w:t>
+              <w:br/>
+              <w:t>Let the point P(1,2,7) . We need the image of P in the line (x / 1)=(y-1 / 1)=(z-2 / 2) This means the line passes through the point A(0,1,2) and has direction ratios vec(d)=(1,1,2). If P^' is the image of P in this line, then the given line is the perpendicular bisector of the segment joining P and P^' in the sense of reflection about a line in 3D. So first we find the foot of perpendicular from P to the line. Let the foot be M . A general point on the line is M(t)=(t,1+t,2+2t). Now, vec(PM)=(t-1,t-1,2t-5). Since PM is perpendicular to the line, we must have vec(PM) · vec(d)=0 So, (t-1)(1)+(t-1)(1)+(2t-5)(2)=0 t-1+t-1+4t-10=0 6t-12=0 t=2 Hence, M=(2,3,6). Since M is the midpoint of P(1,2,7) and its image P^' , we get P^'=2M-P P^'=(4,6,12)-(1,2,7)=(3,4,5). So the image of (1,2,7) in the given line is (3,4,5). Now the distance of (a,2,5) from this image is 4 : √((a-3)^2)+(2-4)^2+(5-5)^2=4 √((a-3)^2)+4=4 Squaring, (a-3)^2+4=16 (a-3)^2=12 a-3= ± 2√(3) So, a=3 ± 2√(3). Therefore, the sum of all possible values of a is (3+2√(3))+(3-2√(3))=6. Hence, the correct option is 6 So, option C is correct.</w:t>
             </w:r>
           </w:p>
         </w:tc>

</xml_diff>

<commit_message>
fix(analyzer): precision concept matching with word boundaries, dominance filtering, and topic tags
</commit_message>
<xml_diff>
--- a/data/exports/3d-geometry_revision_notes.docx
+++ b/data/exports/3d-geometry_revision_notes.docx
@@ -209,7 +209,7 @@
               <w:rPr>
                 <w:sz w:val="19"/>
               </w:rPr>
-              <w:t>209 PYQs</w:t>
+              <w:t>236 PYQs</w:t>
             </w:r>
           </w:p>
         </w:tc>
@@ -296,7 +296,7 @@
               <w:rPr>
                 <w:sz w:val="19"/>
               </w:rPr>
-              <w:t>185 PYQs</w:t>
+              <w:t>156 PYQs</w:t>
             </w:r>
           </w:p>
         </w:tc>
@@ -517,7 +517,7 @@
           <w:color w:val="2B6CB0"/>
           <w:sz w:val="24"/>
         </w:rPr>
-        <w:t>3.1 Planes &amp; Line-Plane Intersections in 3D (Very High Yield — 209 PYQs)</w:t>
+        <w:t>3.1 Planes &amp; Line-Plane Intersections in 3D (Very High Yield — 236 PYQs)</w:t>
       </w:r>
     </w:p>
     <w:p>
@@ -673,7 +673,7 @@
         <w:rPr>
           <w:sz w:val="18"/>
         </w:rPr>
-        <w:t xml:space="preserve">"Let a triangle PQR be such that P and Q lie on the line (x+3 / 8)=(y-4 / 2)=(z+1 / 2) and are at a distance of 6 units from $R..."  </w:t>
+        <w:t xml:space="preserve">"Let L be the line (x+1 / 2)=(y+1 / 3)=(z+3 / 6) and let S be the set of all points (a,b,c) on L , whose distance from the li..."  </w:t>
       </w:r>
       <w:r>
         <w:rPr>
@@ -681,7 +681,7 @@
           <w:color w:val="2B6CB0"/>
           <w:sz w:val="18"/>
         </w:rPr>
-        <w:t>[Ans: C]</w:t>
+        <w:t>[Ans: N/A]</w:t>
       </w:r>
     </w:p>
     <w:p>
@@ -694,13 +694,13 @@
           <w:b/>
           <w:sz w:val="18"/>
         </w:rPr>
-        <w:t xml:space="preserve">[2026 Evening Shift] Q#1 (MCQ): </w:t>
+        <w:t xml:space="preserve">[2026 Evening Shift] Q#2 (MCQ): </w:t>
       </w:r>
       <w:r>
         <w:rPr>
           <w:sz w:val="18"/>
         </w:rPr>
-        <w:t xml:space="preserve">"The shortest distance between the lines vec(r)=((1 / 3)î+2ĵ+(8 / 3)k̂)+λ(2î-5ĵ+6k̂) and $..."  </w:t>
+        <w:t xml:space="preserve">"If (2α+1,α^2-3α,(α-1 / 2)) is the image of (α,2α,1) in the line $\frac{x-2}{3}=\frac{y-1}{2}=\frac{z..."  </w:t>
       </w:r>
       <w:r>
         <w:rPr>
@@ -708,7 +708,7 @@
           <w:color w:val="2B6CB0"/>
           <w:sz w:val="18"/>
         </w:rPr>
-        <w:t>[Ans: B]</w:t>
+        <w:t>[Ans: N/A]</w:t>
       </w:r>
     </w:p>
     <w:p>
@@ -725,7 +725,7 @@
           <w:color w:val="2B6CB0"/>
           <w:sz w:val="24"/>
         </w:rPr>
-        <w:t>3.2 Direction Cosines &amp; Equations of Lines in 3D (Very High Yield — 185 PYQs)</w:t>
+        <w:t>3.2 Direction Cosines &amp; Equations of Lines in 3D (Very High Yield — 156 PYQs)</w:t>
       </w:r>
     </w:p>
     <w:p>
@@ -854,7 +854,7 @@
         <w:rPr>
           <w:sz w:val="18"/>
         </w:rPr>
-        <w:t xml:space="preserve">"Let the point A be the foot of perpendicular drawn from the point P (a,b,0) on the line (x-1 / 2)=(y-2 / 1)=(z-α / 3). ..."  </w:t>
+        <w:t xml:space="preserve">"Let a triangle PQR be such that P and Q lie on the line (x+3 / 8)=(y-4 / 2)=(z+1 / 2) and are at a distance of 6 units from $R..."  </w:t>
       </w:r>
       <w:r>
         <w:rPr>
@@ -862,7 +862,7 @@
           <w:color w:val="2B6CB0"/>
           <w:sz w:val="18"/>
         </w:rPr>
-        <w:t>[Ans: N/A]</w:t>
+        <w:t>[Ans: C]</w:t>
       </w:r>
     </w:p>
     <w:p>
@@ -875,13 +875,13 @@
           <w:b/>
           <w:sz w:val="18"/>
         </w:rPr>
-        <w:t xml:space="preserve">[2026 Evening Shift] Q#2 (MCQ): </w:t>
+        <w:t xml:space="preserve">[2026 Evening Shift] Q#1 (MCQ): </w:t>
       </w:r>
       <w:r>
         <w:rPr>
           <w:sz w:val="18"/>
         </w:rPr>
-        <w:t xml:space="preserve">"The shortest distance between the lines (x-4 / 1)=(y-3 / 2)=(z-2 / -3) and (x+2 / 2)=(y-6 / 4)=(z-5 / -5) is:..."  </w:t>
+        <w:t xml:space="preserve">"The shortest distance between the lines vec(r)=((1 / 3)î+2ĵ+(8 / 3)k̂)+λ(2î-5ĵ+6k̂) and $..."  </w:t>
       </w:r>
       <w:r>
         <w:rPr>
@@ -889,7 +889,7 @@
           <w:color w:val="2B6CB0"/>
           <w:sz w:val="18"/>
         </w:rPr>
-        <w:t>[Ans: N/A]</w:t>
+        <w:t>[Ans: B]</w:t>
       </w:r>
     </w:p>
     <w:p>
@@ -902,13 +902,13 @@
           <w:b/>
           <w:sz w:val="18"/>
         </w:rPr>
-        <w:t xml:space="preserve">[2026 Evening Shift] Q#2 (MCQ): </w:t>
+        <w:t xml:space="preserve">[2026 Evening Shift] Q#1 (MCQ): </w:t>
       </w:r>
       <w:r>
         <w:rPr>
           <w:sz w:val="18"/>
         </w:rPr>
-        <w:t xml:space="preserve">"If the distance of the point (a,2,5) from the image of the point (1,2,7) in the line (x / 1)=(y-1 / 1)=(z-2 / 2) is 4 , th..."  </w:t>
+        <w:t xml:space="preserve">"Let the point A be the foot of perpendicular drawn from the point P (a,b,0) on the line (x-1 / 2)=(y-2 / 1)=(z-α / 3). ..."  </w:t>
       </w:r>
       <w:r>
         <w:rPr>
@@ -916,7 +916,7 @@
           <w:color w:val="2B6CB0"/>
           <w:sz w:val="18"/>
         </w:rPr>
-        <w:t>[Ans: C]</w:t>
+        <w:t>[Ans: N/A]</w:t>
       </w:r>
     </w:p>
     <w:p>
@@ -1069,7 +1069,7 @@
           <w:color w:val="1A365D"/>
           <w:sz w:val="22"/>
         </w:rPr>
-        <w:t>Benchmark Problem 2: JEE Main 2026 (Online) 5th April Evening Shift (Q#2)</w:t>
+        <w:t>Benchmark Problem 2: JEE Main 2026 (Online) 23rd January Evening Shift (Q#2)</w:t>
       </w:r>
     </w:p>
     <w:p>
@@ -1080,57 +1080,7 @@
         <w:rPr>
           <w:sz w:val="20"/>
         </w:rPr>
-        <w:t>If the distance of the point (a,2,5) from the image of the point (1,2,7) in the line (x / 1)=(y-1 / 1)=(z-2 / 2) is 4 , then the sum of all possible values of a is equal to :</w:t>
-      </w:r>
-    </w:p>
-    <w:p>
-      <w:pPr>
-        <w:pStyle w:val="ListBullet"/>
-        <w:spacing w:after="20"/>
-      </w:pPr>
-      <w:r>
-        <w:rPr>
-          <w:sz w:val="19"/>
-        </w:rPr>
-        <w:t>(A) 11</w:t>
-      </w:r>
-    </w:p>
-    <w:p>
-      <w:pPr>
-        <w:pStyle w:val="ListBullet"/>
-        <w:spacing w:after="20"/>
-      </w:pPr>
-      <w:r>
-        <w:rPr>
-          <w:sz w:val="19"/>
-        </w:rPr>
-        <w:t>(B) 9</w:t>
-      </w:r>
-    </w:p>
-    <w:p>
-      <w:pPr>
-        <w:pStyle w:val="ListBullet"/>
-        <w:spacing w:after="20"/>
-      </w:pPr>
-      <w:r>
-        <w:rPr>
-          <w:b/>
-          <w:color w:val="276749"/>
-          <w:sz w:val="19"/>
-        </w:rPr>
-        <w:t>(C) 6</w:t>
-      </w:r>
-    </w:p>
-    <w:p>
-      <w:pPr>
-        <w:pStyle w:val="ListBullet"/>
-        <w:spacing w:after="20"/>
-      </w:pPr>
-      <w:r>
-        <w:rPr>
-          <w:sz w:val="19"/>
-        </w:rPr>
-        <w:t>(D) 4</w:t>
+        <w:t>If the image of the point P(a,2,a) in the line (x / 2)=(y+a / 1)=(z / 1) is Q and the image of Q in the line (x-2b / 2)=(y-a / 1)=(z+2b / -5) is P , then a+b is equal to ____ .</w:t>
       </w:r>
     </w:p>
     <w:tbl>
@@ -1161,7 +1111,7 @@
                 <w:color w:val="1A365D"/>
                 <w:sz w:val="19"/>
               </w:rPr>
-              <w:t>Correct Answer: C</w:t>
+              <w:t>Correct Answer: 3</w:t>
               <w:br/>
             </w:r>
             <w:r>
@@ -1171,7 +1121,7 @@
               </w:rPr>
               <w:t>Solution Analysis:</w:t>
               <w:br/>
-              <w:t>Let the point P(1,2,7) . We need the image of P in the line (x / 1)=(y-1 / 1)=(z-2 / 2) This means the line passes through the point A(0,1,2) and has direction ratios vec(d)=(1,1,2). If P^' is the image of P in this line, then the given line is the perpendicular bisector of the segment joining P and P^' in the sense of reflection about a line in 3D. So first we find the foot of perpendicular from P to the line. Let the foot be M . A general point on the line is M(t)=(t,1+t,2+2t). Now, vec(PM)=(t-1,t-1,2t-5). Since PM is perpendicular to the line, we must have vec(PM) · vec(d)=0 So, (t-1)(1)+(t-1)(1)+(2t-5)(2)=0 t-1+t-1+4t-10=0 6t-12=0 t=2 Hence, M=(2,3,6). Since M is the midpoint of P(1,2,7) and its image P^' , we get P^'=2M-P P^'=(4,6,12)-(1,2,7)=(3,4,5). So the image of (1,2,7) in the given line is (3,4,5). Now the distance of (a,2,5) from this image is 4 : √((a-3)^2)+(2-4)^2+(5-5)^2=4 √((a-3)^2)+4=4 Squaring, (a-3)^2+4=16 (a-3)^2=12 a-3= ± 2√(3) So, a=3 ± 2√(3). Therefore, the sum of all possible values of a is (3+2√(3))+(3-2√(3))=6. Hence, the correct option is 6 So, option C is correct.</w:t>
+              <w:t>For line 1 : (x / 2)=(y+a / 1)=(z / 1)=λ general point M on line is (2λ,λ-a,λ) Pis(a,2,a) vec(PM)=(2λ-a,λ-a-2,λ-a) since PM is perpendicular to line 1 , their dot product is 0 vec(PM) · (2,1,1)=0 2(2λ-a)+1(λ-a-2)+1(λ-a)=0 6λ-4a-2=0 ⇒ λ=(2a+1 / 3) midpointM=((4a+2 / 3),(1-a / 3),(2a+1 / 3)) for line 2: (x-2b / 2)=(y-a / 1)=(z+2b / -5) since P is the image of Q , midpoint M lies on line 2 ((4a+2 / 3)-2b / 2)=((1-a / 3)-a / 1)=((2a+1 / 3)+2b / -5) (4a+2-6b / 6)=(1-4a / 3)=(2a+1+6b / -15) from first two parts: 4a+2-6b=2(1-4a) 4a+2-6b=2-8a ⇒ 12a=6b ⇒ b=2a from last two parts: -5(1-4a)=2a+1+6b -5+20a=2a+1+6(2a) 20a-5=14a+1 6a=6 ⇒ a=1 b=2(1)=2 a+b=1+2=3 the value of a+b is 3 .</w:t>
             </w:r>
           </w:p>
         </w:tc>

</xml_diff>